<commit_message>
Pushing updates to files
</commit_message>
<xml_diff>
--- a/2. Risk Agenda/Coordination-Note.docx
+++ b/2. Risk Agenda/Coordination-Note.docx
@@ -4,139 +4,365 @@
   <w:body>
     <w:p>
       <w:pPr>
-        <w:pStyle w:val="Title"/>
+        <w:rPr>
+          <w:sz w:val="32"/>
+          <w:szCs w:val="32"/>
+        </w:rPr>
       </w:pPr>
       <w:r>
+        <w:rPr>
+          <w:sz w:val="32"/>
+          <w:szCs w:val="32"/>
+        </w:rPr>
         <w:t>Risk Agenda Coordination Note</w:t>
       </w:r>
     </w:p>
     <w:p>
       <w:pPr>
-        <w:pStyle w:val="Subtitle"/>
+        <w:rPr>
+          <w:rFonts w:asciiTheme="majorHAnsi" w:eastAsiaTheme="majorEastAsia" w:hAnsiTheme="majorHAnsi" w:cstheme="majorBidi"/>
+          <w:b/>
+          <w:bCs/>
+          <w:sz w:val="26"/>
+          <w:szCs w:val="28"/>
+          <w:lang w:val="en-CA"/>
+        </w:rPr>
       </w:pPr>
       <w:r>
-        <w:t>For Lester, Nathan, and Urman • From Chris • First draft coordination</w:t>
+        <w:rPr>
+          <w:rFonts w:asciiTheme="majorHAnsi" w:eastAsiaTheme="majorEastAsia" w:hAnsiTheme="majorHAnsi" w:cstheme="majorBidi"/>
+          <w:b/>
+          <w:bCs/>
+          <w:sz w:val="26"/>
+          <w:szCs w:val="28"/>
+          <w:lang w:val="en-CA"/>
+        </w:rPr>
+        <w:t xml:space="preserve">Lester </w:t>
       </w:r>
-    </w:p>
-    <w:p>
       <w:r>
-        <w:t>The Risk Strategy draft sets the direction for our pandemic response. Please use the points below when developing your sections so that the completed Risk Agenda connects objectives, acceptable exposure, resources, and implementation. These are proposed coordination points; your sections should establish the details for team agreement.</w:t>
+        <w:rPr>
+          <w:rFonts w:asciiTheme="majorHAnsi" w:eastAsiaTheme="majorEastAsia" w:hAnsiTheme="majorHAnsi" w:cstheme="majorBidi"/>
+          <w:b/>
+          <w:bCs/>
+          <w:sz w:val="26"/>
+          <w:szCs w:val="28"/>
+          <w:lang w:val="en-CA"/>
+        </w:rPr>
+        <w:t>-</w:t>
+      </w:r>
+      <w:r>
+        <w:rPr>
+          <w:rFonts w:asciiTheme="majorHAnsi" w:eastAsiaTheme="majorEastAsia" w:hAnsiTheme="majorHAnsi" w:cstheme="majorBidi"/>
+          <w:b/>
+          <w:bCs/>
+          <w:sz w:val="26"/>
+          <w:szCs w:val="28"/>
+          <w:lang w:val="en-CA"/>
+        </w:rPr>
+        <w:t xml:space="preserve"> Risk Attitude and Appetite</w:t>
       </w:r>
     </w:p>
     <w:p>
       <w:pPr>
-        <w:pStyle w:val="Heading1"/>
+        <w:rPr>
+          <w:rFonts w:asciiTheme="majorHAnsi" w:eastAsiaTheme="majorEastAsia" w:hAnsiTheme="majorHAnsi" w:cstheme="majorBidi"/>
+          <w:sz w:val="26"/>
+          <w:szCs w:val="28"/>
+          <w:lang w:val="en-CA"/>
+        </w:rPr>
       </w:pPr>
       <w:r>
-        <w:t>Lester — Risk Attitude and Appetite</w:t>
-      </w:r>
-    </w:p>
-    <w:p>
-      <w:r>
-        <w:t>Please distinguish low tolerance for customer harm, information exposure, and failures to meet obligations from a willingness to accept controlled implementation risk where changes improve continuity. A single “very low” appetite statement may not adequately describe this distinction.</w:t>
-      </w:r>
-    </w:p>
-    <w:p>
-      <w:r>
-        <w:t>Define acceptable exposure and the significance benchmarks that determine when an issue requires management attention. Consider service interruption, claims delays, information security, and financial capacity. Explain how appetite relates to our ability to absorb losses and disruption, and identify where information is still needed to establish defensible limits.</w:t>
-      </w:r>
-    </w:p>
-    <w:p>
-      <w:r>
-        <w:t>Coordinate escalation thresholds with Urman and financial or resource limits with Nathan. These should guide the crisis leadership team’s delegated authority. Keep significance thresholds separate from performance measures: the share of staff using approved secure access indicates implementation progress, while an unacceptable service interruption is a risk threshold.</w:t>
+        <w:rPr>
+          <w:rFonts w:asciiTheme="majorHAnsi" w:eastAsiaTheme="majorEastAsia" w:hAnsiTheme="majorHAnsi" w:cstheme="majorBidi"/>
+          <w:sz w:val="26"/>
+          <w:szCs w:val="28"/>
+          <w:lang w:val="en-CA"/>
+        </w:rPr>
+        <w:t>Explain how much risk we are willing to accept in different areas. We should have little tolerance for harm to customers, exposure of confidential information, or failure to meet our obligations. However, we may accept some carefully managed risk when introducing changes that help us keep operating. For example, expanding cloud services may involve temporary disruption but improve our ability to work remotely. Saying our risk appetite is simply “very low” does not fully explain these differences.</w:t>
       </w:r>
     </w:p>
     <w:p>
       <w:pPr>
-        <w:pStyle w:val="Heading1"/>
+        <w:rPr>
+          <w:rFonts w:asciiTheme="majorHAnsi" w:eastAsiaTheme="majorEastAsia" w:hAnsiTheme="majorHAnsi" w:cstheme="majorBidi"/>
+          <w:sz w:val="26"/>
+          <w:szCs w:val="28"/>
+          <w:lang w:val="en-CA"/>
+        </w:rPr>
       </w:pPr>
       <w:r>
-        <w:t>Decisions needed from Lester</w:t>
-      </w:r>
-    </w:p>
-    <w:p>
-      <w:r>
-        <w:t>Propose the appetite by risk area, the basis for significant-risk thresholds, and the conditions requiring executive approval. Identify which limits can be justified now and which require further information. Do not treat the 55/80 index as a probability of loss or a defined appetite limit.</w:t>
+        <w:rPr>
+          <w:rFonts w:asciiTheme="majorHAnsi" w:eastAsiaTheme="majorEastAsia" w:hAnsiTheme="majorHAnsi" w:cstheme="majorBidi"/>
+          <w:sz w:val="26"/>
+          <w:szCs w:val="28"/>
+          <w:lang w:val="en-CA"/>
+        </w:rPr>
+        <w:t>Describe the limits that tell us when a risk needs management attention. Consider how long services can be interrupted, how far claims processing can fall behind, and how much financial loss we can absorb. These limits should reflect our ability to manage the consequences. If we do not have enough information to set a limit, identify what we need.</w:t>
       </w:r>
     </w:p>
     <w:p>
       <w:pPr>
-        <w:pStyle w:val="Heading1"/>
+        <w:rPr>
+          <w:rFonts w:asciiTheme="majorHAnsi" w:eastAsiaTheme="majorEastAsia" w:hAnsiTheme="majorHAnsi" w:cstheme="majorBidi"/>
+          <w:sz w:val="26"/>
+          <w:szCs w:val="28"/>
+          <w:lang w:val="en-CA"/>
+        </w:rPr>
       </w:pPr>
       <w:r>
-        <w:t>Nathan — Risk Resources</w:t>
-      </w:r>
-    </w:p>
-    <w:p>
-      <w:r>
-        <w:t>Identify the people, time, equipment, funding, and specialist support needed for secure continuity of claims processing, premium collection, and customer support. Consider remote-work equipment and training, essential-role backup, IT capacity, security expertise, and supplier oversight.</w:t>
-      </w:r>
-    </w:p>
-    <w:p>
-      <w:r>
-        <w:t>Distinguish currently available resources from proposed additions. Assess potential Tiva support without assuming that funding or staff are committed. Compare internal delivery with specialist support where useful, considering cost, capability, continuity, and retained accountability. Outsourcing work does not automatically transfer its risk.</w:t>
-      </w:r>
-    </w:p>
-    <w:p>
-      <w:r>
-        <w:t>Propose how urgent resource needs will be prioritized and how spending authority will relate to the crisis leadership team’s mandate. Separate immediate stabilization needs from longer-term improvement costs, including recurring cloud and provider costs.</w:t>
+        <w:rPr>
+          <w:rFonts w:asciiTheme="majorHAnsi" w:eastAsiaTheme="majorEastAsia" w:hAnsiTheme="majorHAnsi" w:cstheme="majorBidi"/>
+          <w:sz w:val="26"/>
+          <w:szCs w:val="28"/>
+          <w:lang w:val="en-CA"/>
+        </w:rPr>
+        <w:t>Work with Urman on when issues must be reported to senior management, and with Nathan on spending and resource limits. Together, these should clarify what the crisis leadership team can decide on its own and what needs further approval.</w:t>
       </w:r>
     </w:p>
     <w:p>
       <w:pPr>
-        <w:pStyle w:val="Heading1"/>
+        <w:rPr>
+          <w:rFonts w:asciiTheme="majorHAnsi" w:eastAsiaTheme="majorEastAsia" w:hAnsiTheme="majorHAnsi" w:cstheme="majorBidi"/>
+          <w:sz w:val="26"/>
+          <w:szCs w:val="28"/>
+          <w:lang w:val="en-CA"/>
+        </w:rPr>
       </w:pPr>
       <w:r>
-        <w:t>Decisions needed from Nathan</w:t>
-      </w:r>
-    </w:p>
-    <w:p>
-      <w:r>
-        <w:t>Identify resource gaps, realistic support options, approval responsibilities, and information needed before budgets or spending limits can be confirmed. Coordinate those limits with Lester and provide Urman with the capacity assumptions needed for workable procedures.</w:t>
+        <w:rPr>
+          <w:rFonts w:asciiTheme="majorHAnsi" w:eastAsiaTheme="majorEastAsia" w:hAnsiTheme="majorHAnsi" w:cstheme="majorBidi"/>
+          <w:sz w:val="26"/>
+          <w:szCs w:val="28"/>
+          <w:lang w:val="en-CA"/>
+        </w:rPr>
+        <w:t>Keep risk limits separate from measures of progress. For example, the percentage of staff using secure remote access shows progress. The maximum acceptable length of a service outage is a risk limit.</w:t>
       </w:r>
     </w:p>
     <w:p>
       <w:pPr>
-        <w:pStyle w:val="Heading1"/>
+        <w:rPr>
+          <w:rFonts w:asciiTheme="majorHAnsi" w:eastAsiaTheme="majorEastAsia" w:hAnsiTheme="majorHAnsi" w:cstheme="majorBidi"/>
+          <w:b/>
+          <w:bCs/>
+          <w:sz w:val="26"/>
+          <w:szCs w:val="28"/>
+          <w:lang w:val="en-CA"/>
+        </w:rPr>
       </w:pPr>
       <w:r>
-        <w:lastRenderedPageBreak/>
-        <w:t>Urman — Risk Protocols</w:t>
+        <w:rPr>
+          <w:rFonts w:asciiTheme="majorHAnsi" w:eastAsiaTheme="majorEastAsia" w:hAnsiTheme="majorHAnsi" w:cstheme="majorBidi"/>
+          <w:b/>
+          <w:bCs/>
+          <w:sz w:val="26"/>
+          <w:szCs w:val="28"/>
+          <w:lang w:val="en-CA"/>
+        </w:rPr>
+        <w:t xml:space="preserve">Nathan </w:t>
       </w:r>
-    </w:p>
-    <w:p>
       <w:r>
-        <w:t>Define how risks will be assessed, recorded, escalated, monitored, and reviewed consistently across functions. Establish reporting responsibilities and propose a review frequency, including reviews after significant incidents or changes in conditions.</w:t>
+        <w:rPr>
+          <w:rFonts w:asciiTheme="majorHAnsi" w:eastAsiaTheme="majorEastAsia" w:hAnsiTheme="majorHAnsi" w:cstheme="majorBidi"/>
+          <w:b/>
+          <w:bCs/>
+          <w:sz w:val="26"/>
+          <w:szCs w:val="28"/>
+          <w:lang w:val="en-CA"/>
+        </w:rPr>
+        <w:t>-</w:t>
       </w:r>
-    </w:p>
-    <w:p>
       <w:r>
-        <w:t>Explain how operational changes will be assessed, tested, approved, and reviewed. Relevant areas include secure remote access, cloud changes, recovery testing, supplier substitution, and customer communication. Include a workable escalation route when risk or resource limits are exceeded.</w:t>
-      </w:r>
-    </w:p>
-    <w:p>
-      <w:r>
-        <w:t>Propose definitions and evidence sources for indicators such as service availability, claims backlogs, secure remote access, staffing coverage, and control-test results. Coordinate financial indicators with Finance and Nathan. Agree measurable targets using available baselines rather than inventing unsupported figures.</w:t>
+        <w:rPr>
+          <w:rFonts w:asciiTheme="majorHAnsi" w:eastAsiaTheme="majorEastAsia" w:hAnsiTheme="majorHAnsi" w:cstheme="majorBidi"/>
+          <w:b/>
+          <w:bCs/>
+          <w:sz w:val="26"/>
+          <w:szCs w:val="28"/>
+          <w:lang w:val="en-CA"/>
+        </w:rPr>
+        <w:t xml:space="preserve"> Risk Resources</w:t>
       </w:r>
     </w:p>
     <w:p>
       <w:pPr>
-        <w:pStyle w:val="Heading1"/>
+        <w:rPr>
+          <w:rFonts w:asciiTheme="majorHAnsi" w:eastAsiaTheme="majorEastAsia" w:hAnsiTheme="majorHAnsi" w:cstheme="majorBidi"/>
+          <w:sz w:val="26"/>
+          <w:szCs w:val="28"/>
+          <w:lang w:val="en-CA"/>
+        </w:rPr>
       </w:pPr>
       <w:r>
-        <w:t>Final alignment before combining the sections</w:t>
+        <w:rPr>
+          <w:rFonts w:asciiTheme="majorHAnsi" w:eastAsiaTheme="majorEastAsia" w:hAnsiTheme="majorHAnsi" w:cstheme="majorBidi"/>
+          <w:sz w:val="26"/>
+          <w:szCs w:val="28"/>
+          <w:lang w:val="en-CA"/>
+        </w:rPr>
+        <w:t>Identify what we need to keep claims processing, premium collection, and customer support operating securely. Include staff, time, equipment, funding, and outside expertise. Consider laptops and remote-work training, backup staff for essential roles, IT capacity, security support, and time to monitor suppliers.</w:t>
       </w:r>
     </w:p>
     <w:p>
+      <w:pPr>
+        <w:rPr>
+          <w:rFonts w:asciiTheme="majorHAnsi" w:eastAsiaTheme="majorEastAsia" w:hAnsiTheme="majorHAnsi" w:cstheme="majorBidi"/>
+          <w:sz w:val="26"/>
+          <w:szCs w:val="28"/>
+          <w:lang w:val="en-CA"/>
+        </w:rPr>
+      </w:pPr>
       <w:r>
-        <w:t>Together, confirm delegated authority, escalation thresholds, resource limits, and the evidence required to consider operations stable enough for growth to resume. Ensure proposed controls are described consistently and that each indicator has an owner, an evidence source, and a review arrangement.</w:t>
+        <w:rPr>
+          <w:rFonts w:asciiTheme="majorHAnsi" w:eastAsiaTheme="majorEastAsia" w:hAnsiTheme="majorHAnsi" w:cstheme="majorBidi"/>
+          <w:sz w:val="26"/>
+          <w:szCs w:val="28"/>
+          <w:lang w:val="en-CA"/>
+        </w:rPr>
+        <w:t>Clearly separate resources we already have from resources we still need. Consider whether Tiva could provide support, but do not assume its staff or funding are available. Where outside specialists may help, compare their cost, skills, and reliability with doing the work ourselves. We remain responsible for managing risks even when another organization performs the work.</w:t>
       </w:r>
     </w:p>
     <w:p>
+      <w:pPr>
+        <w:rPr>
+          <w:rFonts w:asciiTheme="majorHAnsi" w:eastAsiaTheme="majorEastAsia" w:hAnsiTheme="majorHAnsi" w:cstheme="majorBidi"/>
+          <w:sz w:val="26"/>
+          <w:szCs w:val="28"/>
+          <w:lang w:val="en-CA"/>
+        </w:rPr>
+      </w:pPr>
       <w:r>
-        <w:t>Textbook basis: Hopkin, P. (2018). Fundamentals of risk management (5th ed.). Kogan Page. Chapter 21, especially Table 21.1 and “Risk management strategy” (uploaded PDF pages 409–416). The six-part strategy structure is our adaptation for the assignment.</w:t>
+        <w:rPr>
+          <w:rFonts w:asciiTheme="majorHAnsi" w:eastAsiaTheme="majorEastAsia" w:hAnsiTheme="majorHAnsi" w:cstheme="majorBidi"/>
+          <w:sz w:val="26"/>
+          <w:szCs w:val="28"/>
+          <w:lang w:val="en-CA"/>
+        </w:rPr>
+        <w:t>Explain which resource needs should come first and who can approve spending. Identify what the crisis leadership team can authorize and what requires senior management approval. Separate immediate needs from longer-term improvements, including ongoing costs such as cloud subscriptions and supplier fees.</w:t>
       </w:r>
     </w:p>
+    <w:p>
+      <w:pPr>
+        <w:rPr>
+          <w:rFonts w:asciiTheme="majorHAnsi" w:eastAsiaTheme="majorEastAsia" w:hAnsiTheme="majorHAnsi" w:cstheme="majorBidi"/>
+          <w:b/>
+          <w:bCs/>
+          <w:sz w:val="26"/>
+          <w:szCs w:val="28"/>
+          <w:lang w:val="en-CA"/>
+        </w:rPr>
+      </w:pPr>
+      <w:r>
+        <w:rPr>
+          <w:rFonts w:asciiTheme="majorHAnsi" w:eastAsiaTheme="majorEastAsia" w:hAnsiTheme="majorHAnsi" w:cstheme="majorBidi"/>
+          <w:b/>
+          <w:bCs/>
+          <w:sz w:val="26"/>
+          <w:szCs w:val="28"/>
+          <w:lang w:val="en-CA"/>
+        </w:rPr>
+        <w:t xml:space="preserve">Urman </w:t>
+      </w:r>
+      <w:r>
+        <w:rPr>
+          <w:rFonts w:asciiTheme="majorHAnsi" w:eastAsiaTheme="majorEastAsia" w:hAnsiTheme="majorHAnsi" w:cstheme="majorBidi"/>
+          <w:b/>
+          <w:bCs/>
+          <w:sz w:val="26"/>
+          <w:szCs w:val="28"/>
+          <w:lang w:val="en-CA"/>
+        </w:rPr>
+        <w:t xml:space="preserve">- </w:t>
+      </w:r>
+      <w:r>
+        <w:rPr>
+          <w:rFonts w:asciiTheme="majorHAnsi" w:eastAsiaTheme="majorEastAsia" w:hAnsiTheme="majorHAnsi" w:cstheme="majorBidi"/>
+          <w:b/>
+          <w:bCs/>
+          <w:sz w:val="26"/>
+          <w:szCs w:val="28"/>
+          <w:lang w:val="en-CA"/>
+        </w:rPr>
+        <w:t>Risk Protocols</w:t>
+      </w:r>
+    </w:p>
+    <w:p>
+      <w:pPr>
+        <w:rPr>
+          <w:rFonts w:asciiTheme="majorHAnsi" w:eastAsiaTheme="majorEastAsia" w:hAnsiTheme="majorHAnsi" w:cstheme="majorBidi"/>
+          <w:sz w:val="26"/>
+          <w:szCs w:val="28"/>
+          <w:lang w:val="en-CA"/>
+        </w:rPr>
+      </w:pPr>
+      <w:r>
+        <w:rPr>
+          <w:rFonts w:asciiTheme="majorHAnsi" w:eastAsiaTheme="majorEastAsia" w:hAnsiTheme="majorHAnsi" w:cstheme="majorBidi"/>
+          <w:sz w:val="26"/>
+          <w:szCs w:val="28"/>
+          <w:lang w:val="en-CA"/>
+        </w:rPr>
+        <w:t>Explain the procedures each department should follow to identify, assess, record, monitor, and review risks. Clarify who reports issues, who receives those reports, and how often reviews take place. Include additional reviews after major incidents or changes in conditions.</w:t>
+      </w:r>
+    </w:p>
+    <w:p>
+      <w:pPr>
+        <w:rPr>
+          <w:rFonts w:asciiTheme="majorHAnsi" w:eastAsiaTheme="majorEastAsia" w:hAnsiTheme="majorHAnsi" w:cstheme="majorBidi"/>
+          <w:sz w:val="26"/>
+          <w:szCs w:val="28"/>
+          <w:lang w:val="en-CA"/>
+        </w:rPr>
+      </w:pPr>
+      <w:r>
+        <w:rPr>
+          <w:rFonts w:asciiTheme="majorHAnsi" w:eastAsiaTheme="majorEastAsia" w:hAnsiTheme="majorHAnsi" w:cstheme="majorBidi"/>
+          <w:sz w:val="26"/>
+          <w:szCs w:val="28"/>
+          <w:lang w:val="en-CA"/>
+        </w:rPr>
+        <w:lastRenderedPageBreak/>
+        <w:t>Describe how proposed operational changes will be checked, tested, approved, and reviewed after implementation. Examples include remote access, cloud services, testing whether systems can recover after an outage, changing suppliers, and customer communication. Explain who must be contacted when a risk exceeds an agreed limit or requires more resources than the team can approve.</w:t>
+      </w:r>
+    </w:p>
+    <w:p>
+      <w:pPr>
+        <w:rPr>
+          <w:rFonts w:asciiTheme="majorHAnsi" w:eastAsiaTheme="majorEastAsia" w:hAnsiTheme="majorHAnsi" w:cstheme="majorBidi"/>
+          <w:sz w:val="26"/>
+          <w:szCs w:val="28"/>
+          <w:lang w:val="en-CA"/>
+        </w:rPr>
+      </w:pPr>
+      <w:r>
+        <w:rPr>
+          <w:rFonts w:asciiTheme="majorHAnsi" w:eastAsiaTheme="majorEastAsia" w:hAnsiTheme="majorHAnsi" w:cstheme="majorBidi"/>
+          <w:sz w:val="26"/>
+          <w:szCs w:val="28"/>
+          <w:lang w:val="en-CA"/>
+        </w:rPr>
+        <w:t>Define how we will measure whether our response is working and where the information will come from. Possible measures include system availability, claims waiting to be processed, staff with secure remote access, backup coverage for key roles, and whether controls pass their tests. Work with Finance and Nathan on financial measures.</w:t>
+      </w:r>
+    </w:p>
+    <w:p>
+      <w:pPr>
+        <w:rPr>
+          <w:rFonts w:asciiTheme="majorHAnsi" w:eastAsiaTheme="majorEastAsia" w:hAnsiTheme="majorHAnsi" w:cstheme="majorBidi"/>
+          <w:sz w:val="26"/>
+          <w:szCs w:val="28"/>
+          <w:lang w:val="en-CA"/>
+        </w:rPr>
+      </w:pPr>
+      <w:r>
+        <w:rPr>
+          <w:rFonts w:asciiTheme="majorHAnsi" w:eastAsiaTheme="majorEastAsia" w:hAnsiTheme="majorHAnsi" w:cstheme="majorBidi"/>
+          <w:sz w:val="26"/>
+          <w:szCs w:val="28"/>
+          <w:lang w:val="en-CA"/>
+        </w:rPr>
+        <w:t>Set measurable targets using what we know about our current performance. Where that information is missing, identify what needs to be collected before a reasonable target can be agreed.</w:t>
+      </w:r>
+    </w:p>
+    <w:p/>
     <w:sectPr>
       <w:pgSz w:w="12240" w:h="15840"/>
       <w:pgMar w:top="1008" w:right="1152" w:bottom="1008" w:left="1152" w:header="720" w:footer="720" w:gutter="0"/>
@@ -958,7 +1184,6 @@
   <w:style w:type="character" w:default="1" w:styleId="DefaultParagraphFont">
     <w:name w:val="Default Paragraph Font"/>
     <w:uiPriority w:val="1"/>
-    <w:semiHidden/>
     <w:unhideWhenUsed/>
   </w:style>
   <w:style w:type="table" w:default="1" w:styleId="TableNormal">

</xml_diff>